<commit_message>
Describe Impact Mining, Inc. as a funding vehicle, not the platform operator, across privacy and legal docs; refresh the public partnership agreement download
Co-Authored-By: Claude Sonnet 5.5 <noreply@anthropic.com>
</commit_message>
<xml_diff>
--- a/public/docs/nextVillage-Partnership-Agreement-DRAFT.docx
+++ b/public/docs/nextVillage-Partnership-Agreement-DRAFT.docx
@@ -47,22 +47,25 @@
     </w:p>
     <w:p>
       <w:r>
-        <w:rPr>
-          <w:b/>
-        </w:rPr>
-        <w:t>vAI</w:t>
-      </w:r>
-      <w:r>
-        <w:t xml:space="preserve">, the nextVillage.community program, run by </w:t>
+        <w:t xml:space="preserve">The </w:t>
       </w:r>
       <w:r>
         <w:rPr>
           <w:b/>
         </w:rPr>
-        <w:t>Kevin Hallinan</w:t>
+        <w:t>Davidson AI Futures Lab</w:t>
       </w:r>
       <w:r>
-        <w:t>, 1629 E. 4th St., Dayton, OH 45403, USA, with the Davidson AI Futures Lab, Oloibiri, Bayelsa State, Nigeria ("</w:t>
+        <w:t xml:space="preserve">, of Oloibiri, Bayelsa State, Nigeria, led by </w:t>
+      </w:r>
+      <w:r>
+        <w:rPr>
+          <w:b/>
+        </w:rPr>
+        <w:t>Mr. Bennywhite Davidson</w:t>
+      </w:r>
+      <w:r>
+        <w:t xml:space="preserve">, which runs the nextVillage.community program ("</w:t>
       </w:r>
       <w:r>
         <w:rPr>
@@ -71,16 +74,7 @@
         <w:t>vAI</w:t>
       </w:r>
       <w:r>
-        <w:t xml:space="preserve">"). vAI expects to assign this agreement to </w:t>
-      </w:r>
-      <w:r>
-        <w:rPr>
-          <w:b/>
-        </w:rPr>
-        <w:t>Impact Mining, Inc.</w:t>
-      </w:r>
-      <w:r>
-        <w:t>, an Ohio nonprofit now being formed, and the Organization agrees to that assignment (clause 14);</w:t>
+        <w:t xml:space="preserve">");</w:t>
       </w:r>
     </w:p>
     <w:p>
@@ -338,16 +332,16 @@
         <w:t>lead mentor</w:t>
       </w:r>
       <w:r>
-        <w:t xml:space="preserve"> from the Organization who is present when learners are, a named </w:t>
+        <w:t xml:space="preserve"> from the Organization who is present when learners are, one or more named </w:t>
       </w:r>
       <w:r>
         <w:rPr>
           <w:b/>
         </w:rPr>
-        <w:t>primary leader</w:t>
+        <w:t>site leaders</w:t>
       </w:r>
       <w:r>
-        <w:t xml:space="preserve"> for the platform, and a named </w:t>
+        <w:t xml:space="preserve"> (one of them is the primary leader for the platform), and a named </w:t>
       </w:r>
       <w:r>
         <w:rPr>
@@ -356,7 +350,25 @@
         <w:t>child safety officer</w:t>
       </w:r>
       <w:r>
-        <w:t xml:space="preserve"> (required: the Organization will not enrol any child until one is named in Schedule B, has completed vAI's leader training and has signed the code of conduct).</w:t>
+        <w:t xml:space="preserve"> (required: the Organization will not enrol any child until one is named in Schedule B, has completed vAI's leader training and has signed the code of conduct). In Schedule B the Organization gives vAI the </w:t>
+      </w:r>
+      <w:r>
+        <w:rPr>
+          <w:b/>
+        </w:rPr>
+        <w:t>name and email of its site leader or leaders</w:t>
+      </w:r>
+      <w:r>
+        <w:t xml:space="preserve"> and the </w:t>
+      </w:r>
+      <w:r>
+        <w:rPr>
+          <w:b/>
+        </w:rPr>
+        <w:t>name, email and WhatsApp number of its child safety officer</w:t>
+      </w:r>
+      <w:r>
+        <w:t xml:space="preserve">, and tells vAI at once if any of them changes.</w:t>
       </w:r>
     </w:p>
     <w:p>
@@ -631,7 +643,7 @@
         <w:pStyle w:val="ListNumber"/>
       </w:pPr>
       <w:r>
-        <w:t xml:space="preserve">vAI keeps ownership of the </w:t>
+        <w:t xml:space="preserve">vAI (the program run by the Davidson AI Futures Lab together with Kevin Hallinan) keeps ownership of the </w:t>
       </w:r>
       <w:r>
         <w:rPr>
@@ -1101,10 +1113,10 @@
         <w:rPr>
           <w:b/>
         </w:rPr>
-        <w:t>Assignment to Impact Mining, Inc.</w:t>
+        <w:t>Assignment.</w:t>
       </w:r>
       <w:r>
-        <w:t xml:space="preserve"> vAI may assign this agreement to Impact Mining, Inc. when it is formed, on written notice, and the Organization agrees. Otherwise neither side may assign it without the other's written consent.</w:t>
+        <w:t xml:space="preserve"> Neither side may assign this agreement without the other's written consent.</w:t>
       </w:r>
     </w:p>
     <w:p>
@@ -1176,7 +1188,7 @@
         <w:t>vAI</w:t>
       </w:r>
       <w:r>
-        <w:t>: ______________________  Name: Kevin Hallinan   Title: Founder, nextVillage.community Date: ____________</w:t>
+        <w:t>: ______________________  Name: Mr. Bennywhite Davidson   Title: Leader, Davidson AI Futures Lab Date: ____________</w:t>
       </w:r>
     </w:p>
     <w:p>
@@ -1630,9 +1642,16 @@
             </w:r>
             <w:r>
               <w:rPr>
+                <w:b/>
                 <w:sz w:val="18"/>
               </w:rPr>
-              <w:t>Primary leader (name, email, WhatsApp/phone)</w:t>
+              <w:t>Site leader or leaders (required)</w:t>
+            </w:r>
+            <w:r>
+              <w:rPr>
+                <w:sz w:val="18"/>
+              </w:rPr>
+              <w:t xml:space="preserve"> (name and email of each; mark the primary leader for the platform)</w:t>
             </w:r>
           </w:p>
         </w:tc>
@@ -1703,7 +1722,20 @@
               <w:rPr>
                 <w:sz w:val="18"/>
               </w:rPr>
-              <w:t xml:space="preserve"> (name, email, WhatsApp/phone)</w:t>
+              <w:t xml:space="preserve"> (name, email and </w:t>
+            </w:r>
+            <w:r>
+              <w:rPr>
+                <w:b/>
+                <w:sz w:val="18"/>
+              </w:rPr>
+              <w:t>WhatsApp number</w:t>
+            </w:r>
+            <w:r>
+              <w:rPr>
+                <w:sz w:val="18"/>
+              </w:rPr>
+              <w:t>)</w:t>
             </w:r>
           </w:p>
         </w:tc>

</xml_diff>

<commit_message>
Describe Impact Mining, Inc. as a funding vehicle, not the platform operator, across privacy and legal docs; refresh the public partnership agreement download (#316)
Co-authored-by: Claude Sonnet 5.5 <noreply@anthropic.com>
</commit_message>
<xml_diff>
--- a/public/docs/nextVillage-Partnership-Agreement-DRAFT.docx
+++ b/public/docs/nextVillage-Partnership-Agreement-DRAFT.docx
@@ -47,22 +47,25 @@
     </w:p>
     <w:p>
       <w:r>
-        <w:rPr>
-          <w:b/>
-        </w:rPr>
-        <w:t>vAI</w:t>
-      </w:r>
-      <w:r>
-        <w:t xml:space="preserve">, the nextVillage.community program, run by </w:t>
+        <w:t xml:space="preserve">The </w:t>
       </w:r>
       <w:r>
         <w:rPr>
           <w:b/>
         </w:rPr>
-        <w:t>Kevin Hallinan</w:t>
+        <w:t>Davidson AI Futures Lab</w:t>
       </w:r>
       <w:r>
-        <w:t>, 1629 E. 4th St., Dayton, OH 45403, USA, with the Davidson AI Futures Lab, Oloibiri, Bayelsa State, Nigeria ("</w:t>
+        <w:t xml:space="preserve">, of Oloibiri, Bayelsa State, Nigeria, led by </w:t>
+      </w:r>
+      <w:r>
+        <w:rPr>
+          <w:b/>
+        </w:rPr>
+        <w:t>Mr. Bennywhite Davidson</w:t>
+      </w:r>
+      <w:r>
+        <w:t xml:space="preserve">, which runs the nextVillage.community program ("</w:t>
       </w:r>
       <w:r>
         <w:rPr>
@@ -71,16 +74,7 @@
         <w:t>vAI</w:t>
       </w:r>
       <w:r>
-        <w:t xml:space="preserve">"). vAI expects to assign this agreement to </w:t>
-      </w:r>
-      <w:r>
-        <w:rPr>
-          <w:b/>
-        </w:rPr>
-        <w:t>Impact Mining, Inc.</w:t>
-      </w:r>
-      <w:r>
-        <w:t>, an Ohio nonprofit now being formed, and the Organization agrees to that assignment (clause 14);</w:t>
+        <w:t xml:space="preserve">");</w:t>
       </w:r>
     </w:p>
     <w:p>
@@ -338,16 +332,16 @@
         <w:t>lead mentor</w:t>
       </w:r>
       <w:r>
-        <w:t xml:space="preserve"> from the Organization who is present when learners are, a named </w:t>
+        <w:t xml:space="preserve"> from the Organization who is present when learners are, one or more named </w:t>
       </w:r>
       <w:r>
         <w:rPr>
           <w:b/>
         </w:rPr>
-        <w:t>primary leader</w:t>
+        <w:t>site leaders</w:t>
       </w:r>
       <w:r>
-        <w:t xml:space="preserve"> for the platform, and a named </w:t>
+        <w:t xml:space="preserve"> (one of them is the primary leader for the platform), and a named </w:t>
       </w:r>
       <w:r>
         <w:rPr>
@@ -356,7 +350,25 @@
         <w:t>child safety officer</w:t>
       </w:r>
       <w:r>
-        <w:t xml:space="preserve"> (required: the Organization will not enrol any child until one is named in Schedule B, has completed vAI's leader training and has signed the code of conduct).</w:t>
+        <w:t xml:space="preserve"> (required: the Organization will not enrol any child until one is named in Schedule B, has completed vAI's leader training and has signed the code of conduct). In Schedule B the Organization gives vAI the </w:t>
+      </w:r>
+      <w:r>
+        <w:rPr>
+          <w:b/>
+        </w:rPr>
+        <w:t>name and email of its site leader or leaders</w:t>
+      </w:r>
+      <w:r>
+        <w:t xml:space="preserve"> and the </w:t>
+      </w:r>
+      <w:r>
+        <w:rPr>
+          <w:b/>
+        </w:rPr>
+        <w:t>name, email and WhatsApp number of its child safety officer</w:t>
+      </w:r>
+      <w:r>
+        <w:t xml:space="preserve">, and tells vAI at once if any of them changes.</w:t>
       </w:r>
     </w:p>
     <w:p>
@@ -631,7 +643,7 @@
         <w:pStyle w:val="ListNumber"/>
       </w:pPr>
       <w:r>
-        <w:t xml:space="preserve">vAI keeps ownership of the </w:t>
+        <w:t xml:space="preserve">vAI (the program run by the Davidson AI Futures Lab together with Kevin Hallinan) keeps ownership of the </w:t>
       </w:r>
       <w:r>
         <w:rPr>
@@ -1101,10 +1113,10 @@
         <w:rPr>
           <w:b/>
         </w:rPr>
-        <w:t>Assignment to Impact Mining, Inc.</w:t>
+        <w:t>Assignment.</w:t>
       </w:r>
       <w:r>
-        <w:t xml:space="preserve"> vAI may assign this agreement to Impact Mining, Inc. when it is formed, on written notice, and the Organization agrees. Otherwise neither side may assign it without the other's written consent.</w:t>
+        <w:t xml:space="preserve"> Neither side may assign this agreement without the other's written consent.</w:t>
       </w:r>
     </w:p>
     <w:p>
@@ -1176,7 +1188,7 @@
         <w:t>vAI</w:t>
       </w:r>
       <w:r>
-        <w:t>: ______________________  Name: Kevin Hallinan   Title: Founder, nextVillage.community Date: ____________</w:t>
+        <w:t>: ______________________  Name: Mr. Bennywhite Davidson   Title: Leader, Davidson AI Futures Lab Date: ____________</w:t>
       </w:r>
     </w:p>
     <w:p>
@@ -1630,9 +1642,16 @@
             </w:r>
             <w:r>
               <w:rPr>
+                <w:b/>
                 <w:sz w:val="18"/>
               </w:rPr>
-              <w:t>Primary leader (name, email, WhatsApp/phone)</w:t>
+              <w:t>Site leader or leaders (required)</w:t>
+            </w:r>
+            <w:r>
+              <w:rPr>
+                <w:sz w:val="18"/>
+              </w:rPr>
+              <w:t xml:space="preserve"> (name and email of each; mark the primary leader for the platform)</w:t>
             </w:r>
           </w:p>
         </w:tc>
@@ -1703,7 +1722,20 @@
               <w:rPr>
                 <w:sz w:val="18"/>
               </w:rPr>
-              <w:t xml:space="preserve"> (name, email, WhatsApp/phone)</w:t>
+              <w:t xml:space="preserve"> (name, email and </w:t>
+            </w:r>
+            <w:r>
+              <w:rPr>
+                <w:b/>
+                <w:sz w:val="18"/>
+              </w:rPr>
+              <w:t>WhatsApp number</w:t>
+            </w:r>
+            <w:r>
+              <w:rPr>
+                <w:sz w:val="18"/>
+              </w:rPr>
+              <w:t>)</w:t>
             </w:r>
           </w:p>
         </w:tc>

</xml_diff>